<commit_message>
Update location (Chalkida) and add Ergeon role progression timeline
</commit_message>
<xml_diff>
--- a/CV_EVANGELOS_Enhanced.docx
+++ b/CV_EVANGELOS_Enhanced.docx
@@ -28,7 +28,7 @@
           <w:color w:val="000000"/>
           <w:sz w:val="22"/>
         </w:rPr>
-        <w:t>Patras, Greece</w:t>
+        <w:t>Chalkida, Greece</w:t>
       </w:r>
       <w:r>
         <w:rPr>
@@ -207,7 +207,7 @@
     </w:p>
     <w:p>
       <w:pPr>
-        <w:spacing w:after="60" w:before="0" w:line="240" w:lineRule="auto"/>
+        <w:spacing w:after="40" w:before="0" w:line="240" w:lineRule="auto"/>
       </w:pPr>
       <w:r>
         <w:rPr>
@@ -234,6 +234,30 @@
           <w:sz w:val="22"/>
         </w:rPr>
         <w:t>JULY 2025 – JULY 2026</w:t>
+      </w:r>
+    </w:p>
+    <w:p>
+      <w:pPr>
+        <w:spacing w:after="80" w:before="0" w:line="240" w:lineRule="auto"/>
+      </w:pPr>
+      <w:r>
+        <w:rPr>
+          <w:rFonts w:ascii="Times New Roman" w:hAnsi="Times New Roman" w:cs="Times New Roman"/>
+          <w:b/>
+          <w:i/>
+          <w:color w:val="000000"/>
+          <w:sz w:val="22"/>
+        </w:rPr>
+        <w:t xml:space="preserve">Progression: </w:t>
+      </w:r>
+      <w:r>
+        <w:rPr>
+          <w:rFonts w:ascii="Times New Roman" w:hAnsi="Times New Roman" w:cs="Times New Roman"/>
+          <w:i/>
+          <w:color w:val="000000"/>
+          <w:sz w:val="22"/>
+        </w:rPr>
+        <w:t>Data Bootcamp (Jul–Aug 2025)  →  Junior Business Analyst L1, Intern (Sep–Dec 2025)  →  Junior Business Analyst L1 (Dec 2025–Apr 2026)  →  Junior Business Analyst L2 (Apr–Jul 2026)</w:t>
       </w:r>
     </w:p>
     <w:p>

</xml_diff>

<commit_message>
Add Projects section (sports-analytics projects) to CV
</commit_message>
<xml_diff>
--- a/CV_EVANGELOS_Enhanced.docx
+++ b/CV_EVANGELOS_Enhanced.docx
@@ -510,6 +510,113 @@
           <w:color w:val="000000"/>
           <w:sz w:val="32"/>
         </w:rPr>
+        <w:t>Projects</w:t>
+      </w:r>
+    </w:p>
+    <w:p>
+      <w:pPr>
+        <w:spacing w:after="80" w:before="0" w:line="240" w:lineRule="auto"/>
+      </w:pPr>
+      <w:r>
+        <w:rPr>
+          <w:rFonts w:ascii="Times New Roman" w:hAnsi="Times New Roman" w:cs="Times New Roman"/>
+          <w:i/>
+          <w:color w:val="000000"/>
+          <w:sz w:val="22"/>
+        </w:rPr>
+        <w:t>Personal sports-analytics projects — full code, data and write-ups on GitHub.</w:t>
+      </w:r>
+    </w:p>
+    <w:p>
+      <w:pPr>
+        <w:spacing w:after="20" w:before="40" w:line="240" w:lineRule="auto"/>
+      </w:pPr>
+      <w:r>
+        <w:rPr>
+          <w:rFonts w:ascii="Times New Roman" w:hAnsi="Times New Roman" w:cs="Times New Roman"/>
+          <w:b/>
+          <w:color w:val="000000"/>
+          <w:sz w:val="22"/>
+        </w:rPr>
+        <w:t xml:space="preserve">Cristiano Ronaldo — UEFA Champions League (2015–2018)   </w:t>
+      </w:r>
+      <w:hyperlink r:id="rId10">
+        <w:r>
+          <w:rPr>
+            <w:rFonts w:ascii="Times New Roman" w:hAnsi="Times New Roman" w:cs="Times New Roman"/>
+            <w:sz w:val="22"/>
+            <w:color w:val="0563C1"/>
+            <w:u w:val="single"/>
+          </w:rPr>
+          <w:t>github.com/EvangelosGkoumas/ronaldo-ucl-2016-2018</w:t>
+        </w:r>
+      </w:hyperlink>
+    </w:p>
+    <w:p>
+      <w:pPr>
+        <w:pStyle w:val="ListBullet"/>
+        <w:spacing w:after="40" w:line="240" w:lineRule="auto"/>
+      </w:pPr>
+      <w:r>
+        <w:rPr>
+          <w:rFonts w:ascii="Times New Roman" w:hAnsi="Times New Roman" w:cs="Times New Roman"/>
+          <w:color w:val="000000"/>
+          <w:sz w:val="22"/>
+        </w:rPr>
+        <w:t>Built a Python pipeline merging two public data sources (openfootball + Wikipedia) into a match-by-match dataset, validated against official goal totals; analysed it with DuckDB SQL and visualised it with matplotlib and mplsoccer (shot maps and heatmaps from StatsBomb event data). Documented in a README, a Jupyter notebook and a PDF report.</w:t>
+      </w:r>
+    </w:p>
+    <w:p>
+      <w:pPr>
+        <w:spacing w:after="20" w:before="60" w:line="240" w:lineRule="auto"/>
+      </w:pPr>
+      <w:r>
+        <w:rPr>
+          <w:rFonts w:ascii="Times New Roman" w:hAnsi="Times New Roman" w:cs="Times New Roman"/>
+          <w:b/>
+          <w:color w:val="000000"/>
+          <w:sz w:val="22"/>
+        </w:rPr>
+        <w:t xml:space="preserve">Russell Westbrook — 2016-17 NBA season   </w:t>
+      </w:r>
+      <w:hyperlink r:id="rId11">
+        <w:r>
+          <w:rPr>
+            <w:rFonts w:ascii="Times New Roman" w:hAnsi="Times New Roman" w:cs="Times New Roman"/>
+            <w:sz w:val="22"/>
+            <w:color w:val="0563C1"/>
+            <w:u w:val="single"/>
+          </w:rPr>
+          <w:t>github.com/EvangelosGkoumas/westbrook-mvp-2016-17</w:t>
+        </w:r>
+      </w:hyperlink>
+    </w:p>
+    <w:p>
+      <w:pPr>
+        <w:pStyle w:val="ListBullet"/>
+        <w:spacing w:after="40" w:line="240" w:lineRule="auto"/>
+      </w:pPr>
+      <w:r>
+        <w:rPr>
+          <w:rFonts w:ascii="Times New Roman" w:hAnsi="Times New Roman" w:cs="Times New Roman"/>
+          <w:color w:val="000000"/>
+          <w:sz w:val="22"/>
+        </w:rPr>
+        <w:t>Parsed game-by-game data from Basketball-Reference into a clean dataset, validated against the record books, aggregated it with DuckDB SQL, and built matplotlib charts. Published as a reproducible repository with a Jupyter notebook.</w:t>
+      </w:r>
+    </w:p>
+    <w:p>
+      <w:pPr>
+        <w:spacing w:after="80" w:before="200" w:line="240" w:lineRule="auto"/>
+      </w:pPr>
+      <w:r>
+        <w:rPr>
+          <w:rFonts w:ascii="Times New Roman" w:hAnsi="Times New Roman" w:cs="Times New Roman"/>
+          <w:b/>
+          <w:caps/>
+          <w:color w:val="000000"/>
+          <w:sz w:val="32"/>
+        </w:rPr>
         <w:t>Technical Skills</w:t>
       </w:r>
     </w:p>
@@ -671,7 +778,7 @@
           <w:color w:val="000000"/>
           <w:sz w:val="22"/>
         </w:rPr>
-        <w:t xml:space="preserve"> — BigQuery (OLAP) and PostgreSQL (OLTP)</w:t>
+        <w:t xml:space="preserve"> — BigQuery (OLAP) and PostgreSQL (OLTP); DuckDB</w:t>
       </w:r>
     </w:p>
     <w:p>
@@ -694,7 +801,7 @@
           <w:color w:val="000000"/>
           <w:sz w:val="22"/>
         </w:rPr>
-        <w:t xml:space="preserve"> — Git / GitHub, Visual Studio Code, JSON configuration</w:t>
+        <w:t xml:space="preserve"> — Git / GitHub, Visual Studio Code, Jupyter, JSON configuration</w:t>
       </w:r>
     </w:p>
     <w:p>

</xml_diff>

<commit_message>
Lighter Personal Projects section, placed above Activities
</commit_message>
<xml_diff>
--- a/CV_EVANGELOS_Enhanced.docx
+++ b/CV_EVANGELOS_Enhanced.docx
@@ -496,113 +496,6 @@
           <w:sz w:val="22"/>
         </w:rPr>
         <w:t>Conducted routine maintenance on equipment to prevent downtime and improve output.</w:t>
-      </w:r>
-    </w:p>
-    <w:p>
-      <w:pPr>
-        <w:spacing w:after="80" w:before="200" w:line="240" w:lineRule="auto"/>
-      </w:pPr>
-      <w:r>
-        <w:rPr>
-          <w:rFonts w:ascii="Times New Roman" w:hAnsi="Times New Roman" w:cs="Times New Roman"/>
-          <w:b/>
-          <w:caps/>
-          <w:color w:val="000000"/>
-          <w:sz w:val="32"/>
-        </w:rPr>
-        <w:t>Projects</w:t>
-      </w:r>
-    </w:p>
-    <w:p>
-      <w:pPr>
-        <w:spacing w:after="80" w:before="0" w:line="240" w:lineRule="auto"/>
-      </w:pPr>
-      <w:r>
-        <w:rPr>
-          <w:rFonts w:ascii="Times New Roman" w:hAnsi="Times New Roman" w:cs="Times New Roman"/>
-          <w:i/>
-          <w:color w:val="000000"/>
-          <w:sz w:val="22"/>
-        </w:rPr>
-        <w:t>Personal sports-analytics projects — full code, data and write-ups on GitHub.</w:t>
-      </w:r>
-    </w:p>
-    <w:p>
-      <w:pPr>
-        <w:spacing w:after="20" w:before="40" w:line="240" w:lineRule="auto"/>
-      </w:pPr>
-      <w:r>
-        <w:rPr>
-          <w:rFonts w:ascii="Times New Roman" w:hAnsi="Times New Roman" w:cs="Times New Roman"/>
-          <w:b/>
-          <w:color w:val="000000"/>
-          <w:sz w:val="22"/>
-        </w:rPr>
-        <w:t xml:space="preserve">Cristiano Ronaldo — UEFA Champions League (2015–2018)   </w:t>
-      </w:r>
-      <w:hyperlink r:id="rId10">
-        <w:r>
-          <w:rPr>
-            <w:rFonts w:ascii="Times New Roman" w:hAnsi="Times New Roman" w:cs="Times New Roman"/>
-            <w:sz w:val="22"/>
-            <w:color w:val="0563C1"/>
-            <w:u w:val="single"/>
-          </w:rPr>
-          <w:t>github.com/EvangelosGkoumas/ronaldo-ucl-2016-2018</w:t>
-        </w:r>
-      </w:hyperlink>
-    </w:p>
-    <w:p>
-      <w:pPr>
-        <w:pStyle w:val="ListBullet"/>
-        <w:spacing w:after="40" w:line="240" w:lineRule="auto"/>
-      </w:pPr>
-      <w:r>
-        <w:rPr>
-          <w:rFonts w:ascii="Times New Roman" w:hAnsi="Times New Roman" w:cs="Times New Roman"/>
-          <w:color w:val="000000"/>
-          <w:sz w:val="22"/>
-        </w:rPr>
-        <w:t>Built a Python pipeline merging two public data sources (openfootball + Wikipedia) into a match-by-match dataset, validated against official goal totals; analysed it with DuckDB SQL and visualised it with matplotlib and mplsoccer (shot maps and heatmaps from StatsBomb event data). Documented in a README, a Jupyter notebook and a PDF report.</w:t>
-      </w:r>
-    </w:p>
-    <w:p>
-      <w:pPr>
-        <w:spacing w:after="20" w:before="60" w:line="240" w:lineRule="auto"/>
-      </w:pPr>
-      <w:r>
-        <w:rPr>
-          <w:rFonts w:ascii="Times New Roman" w:hAnsi="Times New Roman" w:cs="Times New Roman"/>
-          <w:b/>
-          <w:color w:val="000000"/>
-          <w:sz w:val="22"/>
-        </w:rPr>
-        <w:t xml:space="preserve">Russell Westbrook — 2016-17 NBA season   </w:t>
-      </w:r>
-      <w:hyperlink r:id="rId11">
-        <w:r>
-          <w:rPr>
-            <w:rFonts w:ascii="Times New Roman" w:hAnsi="Times New Roman" w:cs="Times New Roman"/>
-            <w:sz w:val="22"/>
-            <w:color w:val="0563C1"/>
-            <w:u w:val="single"/>
-          </w:rPr>
-          <w:t>github.com/EvangelosGkoumas/westbrook-mvp-2016-17</w:t>
-        </w:r>
-      </w:hyperlink>
-    </w:p>
-    <w:p>
-      <w:pPr>
-        <w:pStyle w:val="ListBullet"/>
-        <w:spacing w:after="40" w:line="240" w:lineRule="auto"/>
-      </w:pPr>
-      <w:r>
-        <w:rPr>
-          <w:rFonts w:ascii="Times New Roman" w:hAnsi="Times New Roman" w:cs="Times New Roman"/>
-          <w:color w:val="000000"/>
-          <w:sz w:val="22"/>
-        </w:rPr>
-        <w:t>Parsed game-by-game data from Basketball-Reference into a clean dataset, validated against the record books, aggregated it with DuckDB SQL, and built matplotlib charts. Published as a reproducible repository with a Jupyter notebook.</w:t>
       </w:r>
     </w:p>
     <w:p>
@@ -1237,6 +1130,103 @@
           <w:color w:val="000000"/>
           <w:sz w:val="32"/>
         </w:rPr>
+        <w:t>Personal Projects</w:t>
+      </w:r>
+    </w:p>
+    <w:p>
+      <w:pPr>
+        <w:spacing w:after="60" w:before="0" w:line="240" w:lineRule="auto"/>
+      </w:pPr>
+      <w:r>
+        <w:rPr>
+          <w:rFonts w:ascii="Times New Roman" w:hAnsi="Times New Roman" w:cs="Times New Roman"/>
+          <w:i/>
+          <w:color w:val="000000"/>
+          <w:sz w:val="22"/>
+        </w:rPr>
+        <w:t>Exploring sports analytics through small personal projects (ongoing, self-taught):</w:t>
+      </w:r>
+    </w:p>
+    <w:p>
+      <w:pPr>
+        <w:pStyle w:val="ListBullet"/>
+        <w:spacing w:after="40" w:line="240" w:lineRule="auto"/>
+      </w:pPr>
+      <w:r>
+        <w:rPr>
+          <w:rFonts w:ascii="Times New Roman" w:hAnsi="Times New Roman" w:cs="Times New Roman"/>
+          <w:b/>
+          <w:color w:val="000000"/>
+          <w:sz w:val="22"/>
+        </w:rPr>
+        <w:t>Cristiano Ronaldo — Champions League goals (2015–2018)</w:t>
+      </w:r>
+      <w:r>
+        <w:rPr>
+          <w:rFonts w:ascii="Times New Roman" w:hAnsi="Times New Roman" w:cs="Times New Roman"/>
+          <w:color w:val="000000"/>
+          <w:sz w:val="22"/>
+        </w:rPr>
+        <w:t xml:space="preserve"> — Python, SQL, data visualization   </w:t>
+      </w:r>
+      <w:hyperlink r:id="rId10">
+        <w:r>
+          <w:rPr>
+            <w:rFonts w:ascii="Times New Roman" w:hAnsi="Times New Roman" w:cs="Times New Roman"/>
+            <w:sz w:val="22"/>
+            <w:color w:val="0563C1"/>
+            <w:u w:val="single"/>
+          </w:rPr>
+          <w:t>GitHub</w:t>
+        </w:r>
+      </w:hyperlink>
+    </w:p>
+    <w:p>
+      <w:pPr>
+        <w:pStyle w:val="ListBullet"/>
+        <w:spacing w:after="40" w:line="240" w:lineRule="auto"/>
+      </w:pPr>
+      <w:r>
+        <w:rPr>
+          <w:rFonts w:ascii="Times New Roman" w:hAnsi="Times New Roman" w:cs="Times New Roman"/>
+          <w:b/>
+          <w:color w:val="000000"/>
+          <w:sz w:val="22"/>
+        </w:rPr>
+        <w:t>Russell Westbrook — 2016-17 NBA season</w:t>
+      </w:r>
+      <w:r>
+        <w:rPr>
+          <w:rFonts w:ascii="Times New Roman" w:hAnsi="Times New Roman" w:cs="Times New Roman"/>
+          <w:color w:val="000000"/>
+          <w:sz w:val="22"/>
+        </w:rPr>
+        <w:t xml:space="preserve"> — Python, SQL, data visualization   </w:t>
+      </w:r>
+      <w:hyperlink r:id="rId11">
+        <w:r>
+          <w:rPr>
+            <w:rFonts w:ascii="Times New Roman" w:hAnsi="Times New Roman" w:cs="Times New Roman"/>
+            <w:sz w:val="22"/>
+            <w:color w:val="0563C1"/>
+            <w:u w:val="single"/>
+          </w:rPr>
+          <w:t>GitHub</w:t>
+        </w:r>
+      </w:hyperlink>
+    </w:p>
+    <w:p>
+      <w:pPr>
+        <w:spacing w:after="80" w:before="200" w:line="240" w:lineRule="auto"/>
+      </w:pPr>
+      <w:r>
+        <w:rPr>
+          <w:rFonts w:ascii="Times New Roman" w:hAnsi="Times New Roman" w:cs="Times New Roman"/>
+          <w:b/>
+          <w:caps/>
+          <w:color w:val="000000"/>
+          <w:sz w:val="32"/>
+        </w:rPr>
         <w:t>Activities</w:t>
       </w:r>
     </w:p>

</xml_diff>

<commit_message>
Add World Cup 2026 forecast to Personal Projects
</commit_message>
<xml_diff>
--- a/CV_EVANGELOS_Enhanced.docx
+++ b/CV_EVANGELOS_Enhanced.docx
@@ -1217,6 +1217,40 @@
     </w:p>
     <w:p>
       <w:pPr>
+        <w:pStyle w:val="ListBullet"/>
+        <w:spacing w:after="40" w:line="240" w:lineRule="auto"/>
+      </w:pPr>
+      <w:r>
+        <w:rPr>
+          <w:rFonts w:ascii="Times New Roman" w:hAnsi="Times New Roman" w:cs="Times New Roman"/>
+          <w:b/>
+          <w:color w:val="000000"/>
+          <w:sz w:val="22"/>
+        </w:rPr>
+        <w:t>World Cup 2026 — title forecast</w:t>
+      </w:r>
+      <w:r>
+        <w:rPr>
+          <w:rFonts w:ascii="Times New Roman" w:hAnsi="Times New Roman" w:cs="Times New Roman"/>
+          <w:color w:val="000000"/>
+          <w:sz w:val="22"/>
+        </w:rPr>
+        <w:t xml:space="preserve"> — Python, SQL, Monte-Carlo simulation (Elo model)   </w:t>
+      </w:r>
+      <w:hyperlink r:id="rId12">
+        <w:r>
+          <w:rPr>
+            <w:rFonts w:ascii="Times New Roman" w:hAnsi="Times New Roman" w:cs="Times New Roman"/>
+            <w:sz w:val="22"/>
+            <w:color w:val="0563C1"/>
+            <w:u w:val="single"/>
+          </w:rPr>
+          <w:t>GitHub</w:t>
+        </w:r>
+      </w:hyperlink>
+    </w:p>
+    <w:p>
+      <w:pPr>
         <w:spacing w:after="80" w:before="200" w:line="240" w:lineRule="auto"/>
       </w:pPr>
       <w:r>

</xml_diff>